<commit_message>
Added Part3 Sql Challenge
</commit_message>
<xml_diff>
--- a/docs/VU Mobile.docx
+++ b/docs/VU Mobile.docx
@@ -32,7 +32,7 @@
           <w:szCs w:val="24"/>
           <w:rtl w:val="0"/>
         </w:rPr>
-        <w:t xml:space="preserve">1.</w:t>
+        <w:t xml:space="preserve">Part 1: System design.</w:t>
       </w:r>
     </w:p>
     <w:p>
@@ -4121,6 +4121,1086 @@
       <w:pPr>
         <w:rPr>
           <w:rFonts w:ascii="Courier New" w:cs="Courier New" w:eastAsia="Courier New" w:hAnsi="Courier New"/>
+          <w:sz w:val="24"/>
+          <w:szCs w:val="24"/>
+        </w:rPr>
+      </w:pPr>
+      <w:r>
+        <w:rPr>
+          <w:rtl w:val="0"/>
+        </w:rPr>
+      </w:r>
+    </w:p>
+    <w:p>
+      <w:pPr>
+        <w:rPr>
+          <w:sz w:val="24"/>
+          <w:szCs w:val="24"/>
+        </w:rPr>
+      </w:pPr>
+      <w:r>
+        <w:rPr>
+          <w:rtl w:val="0"/>
+        </w:rPr>
+      </w:r>
+    </w:p>
+    <w:p>
+      <w:pPr>
+        <w:rPr>
+          <w:sz w:val="24"/>
+          <w:szCs w:val="24"/>
+        </w:rPr>
+      </w:pPr>
+      <w:r>
+        <w:rPr>
+          <w:rtl w:val="0"/>
+        </w:rPr>
+      </w:r>
+    </w:p>
+    <w:p>
+      <w:pPr>
+        <w:rPr>
+          <w:sz w:val="24"/>
+          <w:szCs w:val="24"/>
+        </w:rPr>
+      </w:pPr>
+      <w:r>
+        <w:rPr>
+          <w:rtl w:val="0"/>
+        </w:rPr>
+      </w:r>
+    </w:p>
+    <w:p>
+      <w:pPr>
+        <w:rPr>
+          <w:sz w:val="24"/>
+          <w:szCs w:val="24"/>
+        </w:rPr>
+      </w:pPr>
+      <w:r>
+        <w:rPr>
+          <w:rtl w:val="0"/>
+        </w:rPr>
+      </w:r>
+    </w:p>
+    <w:p>
+      <w:pPr>
+        <w:rPr>
+          <w:sz w:val="24"/>
+          <w:szCs w:val="24"/>
+        </w:rPr>
+      </w:pPr>
+      <w:r>
+        <w:rPr>
+          <w:rtl w:val="0"/>
+        </w:rPr>
+      </w:r>
+    </w:p>
+    <w:p>
+      <w:pPr>
+        <w:rPr>
+          <w:sz w:val="24"/>
+          <w:szCs w:val="24"/>
+        </w:rPr>
+      </w:pPr>
+      <w:r>
+        <w:rPr>
+          <w:rtl w:val="0"/>
+        </w:rPr>
+      </w:r>
+    </w:p>
+    <w:p>
+      <w:pPr>
+        <w:rPr>
+          <w:sz w:val="24"/>
+          <w:szCs w:val="24"/>
+        </w:rPr>
+      </w:pPr>
+      <w:r>
+        <w:rPr>
+          <w:rtl w:val="0"/>
+        </w:rPr>
+      </w:r>
+    </w:p>
+    <w:p>
+      <w:pPr>
+        <w:rPr>
+          <w:sz w:val="24"/>
+          <w:szCs w:val="24"/>
+        </w:rPr>
+      </w:pPr>
+      <w:r>
+        <w:rPr>
+          <w:rtl w:val="0"/>
+        </w:rPr>
+      </w:r>
+    </w:p>
+    <w:p>
+      <w:pPr>
+        <w:rPr>
+          <w:sz w:val="24"/>
+          <w:szCs w:val="24"/>
+        </w:rPr>
+      </w:pPr>
+      <w:r>
+        <w:rPr>
+          <w:rtl w:val="0"/>
+        </w:rPr>
+      </w:r>
+    </w:p>
+    <w:p>
+      <w:pPr>
+        <w:rPr>
+          <w:sz w:val="24"/>
+          <w:szCs w:val="24"/>
+        </w:rPr>
+      </w:pPr>
+      <w:r>
+        <w:rPr>
+          <w:rtl w:val="0"/>
+        </w:rPr>
+      </w:r>
+    </w:p>
+    <w:p>
+      <w:pPr>
+        <w:rPr>
+          <w:sz w:val="24"/>
+          <w:szCs w:val="24"/>
+        </w:rPr>
+      </w:pPr>
+      <w:r>
+        <w:rPr>
+          <w:rtl w:val="0"/>
+        </w:rPr>
+      </w:r>
+    </w:p>
+    <w:p>
+      <w:pPr>
+        <w:rPr>
+          <w:sz w:val="24"/>
+          <w:szCs w:val="24"/>
+        </w:rPr>
+      </w:pPr>
+      <w:r>
+        <w:rPr>
+          <w:rtl w:val="0"/>
+        </w:rPr>
+      </w:r>
+    </w:p>
+    <w:p>
+      <w:pPr>
+        <w:rPr>
+          <w:sz w:val="24"/>
+          <w:szCs w:val="24"/>
+        </w:rPr>
+      </w:pPr>
+      <w:r>
+        <w:rPr>
+          <w:rtl w:val="0"/>
+        </w:rPr>
+      </w:r>
+    </w:p>
+    <w:p>
+      <w:pPr>
+        <w:rPr>
+          <w:sz w:val="24"/>
+          <w:szCs w:val="24"/>
+        </w:rPr>
+      </w:pPr>
+      <w:r>
+        <w:rPr>
+          <w:sz w:val="24"/>
+          <w:szCs w:val="24"/>
+          <w:rtl w:val="0"/>
+        </w:rPr>
+        <w:t xml:space="preserve">Part 3: Sql challenge</w:t>
+      </w:r>
+    </w:p>
+    <w:p>
+      <w:pPr>
+        <w:rPr>
+          <w:b w:val="1"/>
+          <w:sz w:val="32"/>
+          <w:szCs w:val="32"/>
+        </w:rPr>
+      </w:pPr>
+      <w:r>
+        <w:rPr>
+          <w:sz w:val="24"/>
+          <w:szCs w:val="24"/>
+          <w:rtl w:val="0"/>
+        </w:rPr>
+        <w:t xml:space="preserve">1.</w:t>
+      </w:r>
+      <w:r>
+        <w:rPr>
+          <w:rtl w:val="0"/>
+        </w:rPr>
+      </w:r>
+    </w:p>
+    <w:p>
+      <w:pPr>
+        <w:spacing w:after="220" w:before="220" w:lineRule="auto"/>
+        <w:rPr>
+          <w:sz w:val="24"/>
+          <w:szCs w:val="24"/>
+        </w:rPr>
+      </w:pPr>
+      <w:r>
+        <w:rPr>
+          <w:sz w:val="24"/>
+          <w:szCs w:val="24"/>
+          <w:rtl w:val="0"/>
+        </w:rPr>
+        <w:t xml:space="preserve">Indexes are like lookup tables that allow the database to find rows faster without scanning the entire table. They are especially useful for:</w:t>
+      </w:r>
+    </w:p>
+    <w:p>
+      <w:pPr>
+        <w:numPr>
+          <w:ilvl w:val="0"/>
+          <w:numId w:val="1"/>
+        </w:numPr>
+        <w:spacing w:after="0" w:afterAutospacing="0" w:before="220" w:lineRule="auto"/>
+        <w:ind w:left="720" w:hanging="360"/>
+        <w:rPr>
+          <w:sz w:val="24"/>
+          <w:szCs w:val="24"/>
+        </w:rPr>
+      </w:pPr>
+      <w:r>
+        <w:rPr>
+          <w:sz w:val="24"/>
+          <w:szCs w:val="24"/>
+          <w:rtl w:val="0"/>
+        </w:rPr>
+        <w:t xml:space="preserve">Searching (</w:t>
+      </w:r>
+      <w:r>
+        <w:rPr>
+          <w:rFonts w:ascii="Roboto Mono" w:cs="Roboto Mono" w:eastAsia="Roboto Mono" w:hAnsi="Roboto Mono"/>
+          <w:color w:val="188038"/>
+          <w:sz w:val="24"/>
+          <w:szCs w:val="24"/>
+          <w:rtl w:val="0"/>
+        </w:rPr>
+        <w:t xml:space="preserve">WHERE</w:t>
+      </w:r>
+      <w:r>
+        <w:rPr>
+          <w:sz w:val="24"/>
+          <w:szCs w:val="24"/>
+          <w:rtl w:val="0"/>
+        </w:rPr>
+        <w:t xml:space="preserve">, </w:t>
+      </w:r>
+      <w:r>
+        <w:rPr>
+          <w:rFonts w:ascii="Roboto Mono" w:cs="Roboto Mono" w:eastAsia="Roboto Mono" w:hAnsi="Roboto Mono"/>
+          <w:color w:val="188038"/>
+          <w:sz w:val="24"/>
+          <w:szCs w:val="24"/>
+          <w:rtl w:val="0"/>
+        </w:rPr>
+        <w:t xml:space="preserve">LIKE</w:t>
+      </w:r>
+      <w:r>
+        <w:rPr>
+          <w:sz w:val="24"/>
+          <w:szCs w:val="24"/>
+          <w:rtl w:val="0"/>
+        </w:rPr>
+        <w:t xml:space="preserve">)</w:t>
+      </w:r>
+    </w:p>
+    <w:p>
+      <w:pPr>
+        <w:numPr>
+          <w:ilvl w:val="0"/>
+          <w:numId w:val="1"/>
+        </w:numPr>
+        <w:spacing w:after="0" w:afterAutospacing="0" w:before="0" w:beforeAutospacing="0" w:lineRule="auto"/>
+        <w:ind w:left="720" w:hanging="360"/>
+        <w:rPr>
+          <w:sz w:val="24"/>
+          <w:szCs w:val="24"/>
+        </w:rPr>
+      </w:pPr>
+      <w:r>
+        <w:rPr>
+          <w:sz w:val="24"/>
+          <w:szCs w:val="24"/>
+          <w:rtl w:val="0"/>
+        </w:rPr>
+        <w:t xml:space="preserve">Sorting (</w:t>
+      </w:r>
+      <w:r>
+        <w:rPr>
+          <w:rFonts w:ascii="Roboto Mono" w:cs="Roboto Mono" w:eastAsia="Roboto Mono" w:hAnsi="Roboto Mono"/>
+          <w:color w:val="188038"/>
+          <w:sz w:val="24"/>
+          <w:szCs w:val="24"/>
+          <w:rtl w:val="0"/>
+        </w:rPr>
+        <w:t xml:space="preserve">ORDER BY</w:t>
+      </w:r>
+      <w:r>
+        <w:rPr>
+          <w:sz w:val="24"/>
+          <w:szCs w:val="24"/>
+          <w:rtl w:val="0"/>
+        </w:rPr>
+        <w:t xml:space="preserve">)</w:t>
+      </w:r>
+    </w:p>
+    <w:p>
+      <w:pPr>
+        <w:numPr>
+          <w:ilvl w:val="0"/>
+          <w:numId w:val="1"/>
+        </w:numPr>
+        <w:spacing w:after="0" w:afterAutospacing="0" w:before="0" w:beforeAutospacing="0" w:lineRule="auto"/>
+        <w:ind w:left="720" w:hanging="360"/>
+        <w:rPr>
+          <w:sz w:val="24"/>
+          <w:szCs w:val="24"/>
+        </w:rPr>
+      </w:pPr>
+      <w:r>
+        <w:rPr>
+          <w:sz w:val="24"/>
+          <w:szCs w:val="24"/>
+          <w:rtl w:val="0"/>
+        </w:rPr>
+        <w:t xml:space="preserve">Joining tables (</w:t>
+      </w:r>
+      <w:r>
+        <w:rPr>
+          <w:rFonts w:ascii="Roboto Mono" w:cs="Roboto Mono" w:eastAsia="Roboto Mono" w:hAnsi="Roboto Mono"/>
+          <w:color w:val="188038"/>
+          <w:sz w:val="24"/>
+          <w:szCs w:val="24"/>
+          <w:rtl w:val="0"/>
+        </w:rPr>
+        <w:t xml:space="preserve">JOIN ON</w:t>
+      </w:r>
+      <w:r>
+        <w:rPr>
+          <w:sz w:val="24"/>
+          <w:szCs w:val="24"/>
+          <w:rtl w:val="0"/>
+        </w:rPr>
+        <w:t xml:space="preserve">)</w:t>
+      </w:r>
+    </w:p>
+    <w:p>
+      <w:pPr>
+        <w:numPr>
+          <w:ilvl w:val="0"/>
+          <w:numId w:val="1"/>
+        </w:numPr>
+        <w:spacing w:after="0" w:afterAutospacing="0" w:before="0" w:beforeAutospacing="0" w:lineRule="auto"/>
+        <w:ind w:left="720" w:hanging="360"/>
+        <w:rPr>
+          <w:sz w:val="24"/>
+          <w:szCs w:val="24"/>
+        </w:rPr>
+      </w:pPr>
+      <w:r>
+        <w:rPr>
+          <w:sz w:val="24"/>
+          <w:szCs w:val="24"/>
+          <w:rtl w:val="0"/>
+        </w:rPr>
+        <w:t xml:space="preserve">Enforcing uniqueness (</w:t>
+      </w:r>
+      <w:r>
+        <w:rPr>
+          <w:rFonts w:ascii="Roboto Mono" w:cs="Roboto Mono" w:eastAsia="Roboto Mono" w:hAnsi="Roboto Mono"/>
+          <w:color w:val="188038"/>
+          <w:sz w:val="24"/>
+          <w:szCs w:val="24"/>
+          <w:rtl w:val="0"/>
+        </w:rPr>
+        <w:t xml:space="preserve">UNIQUE</w:t>
+      </w:r>
+      <w:r>
+        <w:rPr>
+          <w:sz w:val="24"/>
+          <w:szCs w:val="24"/>
+          <w:rtl w:val="0"/>
+        </w:rPr>
+        <w:t xml:space="preserve">)</w:t>
+      </w:r>
+    </w:p>
+    <w:p>
+      <w:pPr>
+        <w:numPr>
+          <w:ilvl w:val="0"/>
+          <w:numId w:val="1"/>
+        </w:numPr>
+        <w:spacing w:after="220" w:before="0" w:beforeAutospacing="0" w:lineRule="auto"/>
+        <w:ind w:left="720" w:hanging="360"/>
+        <w:rPr>
+          <w:sz w:val="24"/>
+          <w:szCs w:val="24"/>
+        </w:rPr>
+      </w:pPr>
+      <w:r>
+        <w:rPr>
+          <w:sz w:val="24"/>
+          <w:szCs w:val="24"/>
+          <w:rtl w:val="0"/>
+        </w:rPr>
+        <w:t xml:space="preserve">Filtering (</w:t>
+      </w:r>
+      <w:r>
+        <w:rPr>
+          <w:rFonts w:ascii="Roboto Mono" w:cs="Roboto Mono" w:eastAsia="Roboto Mono" w:hAnsi="Roboto Mono"/>
+          <w:color w:val="188038"/>
+          <w:sz w:val="24"/>
+          <w:szCs w:val="24"/>
+          <w:rtl w:val="0"/>
+        </w:rPr>
+        <w:t xml:space="preserve">GROUP BY</w:t>
+      </w:r>
+      <w:r>
+        <w:rPr>
+          <w:sz w:val="24"/>
+          <w:szCs w:val="24"/>
+          <w:rtl w:val="0"/>
+        </w:rPr>
+        <w:t xml:space="preserve">, </w:t>
+      </w:r>
+      <w:r>
+        <w:rPr>
+          <w:rFonts w:ascii="Roboto Mono" w:cs="Roboto Mono" w:eastAsia="Roboto Mono" w:hAnsi="Roboto Mono"/>
+          <w:color w:val="188038"/>
+          <w:sz w:val="24"/>
+          <w:szCs w:val="24"/>
+          <w:rtl w:val="0"/>
+        </w:rPr>
+        <w:t xml:space="preserve">HAVING</w:t>
+      </w:r>
+      <w:r>
+        <w:rPr>
+          <w:sz w:val="24"/>
+          <w:szCs w:val="24"/>
+          <w:rtl w:val="0"/>
+        </w:rPr>
+        <w:t xml:space="preserve">)</w:t>
+      </w:r>
+    </w:p>
+    <w:p>
+      <w:pPr>
+        <w:rPr>
+          <w:sz w:val="24"/>
+          <w:szCs w:val="24"/>
+        </w:rPr>
+      </w:pPr>
+      <w:r>
+        <w:rPr>
+          <w:sz w:val="24"/>
+          <w:szCs w:val="24"/>
+          <w:rtl w:val="0"/>
+        </w:rPr>
+        <w:t xml:space="preserve">CREATE TABLE Users (</w:t>
+      </w:r>
+    </w:p>
+    <w:p>
+      <w:pPr>
+        <w:rPr>
+          <w:sz w:val="24"/>
+          <w:szCs w:val="24"/>
+        </w:rPr>
+      </w:pPr>
+      <w:r>
+        <w:rPr>
+          <w:sz w:val="24"/>
+          <w:szCs w:val="24"/>
+          <w:rtl w:val="0"/>
+        </w:rPr>
+        <w:t xml:space="preserve">    Id INTEGER PRIMARY KEY,</w:t>
+      </w:r>
+    </w:p>
+    <w:p>
+      <w:pPr>
+        <w:rPr>
+          <w:sz w:val="24"/>
+          <w:szCs w:val="24"/>
+        </w:rPr>
+      </w:pPr>
+      <w:r>
+        <w:rPr>
+          <w:sz w:val="24"/>
+          <w:szCs w:val="24"/>
+          <w:rtl w:val="0"/>
+        </w:rPr>
+        <w:t xml:space="preserve">    Name TEXT,</w:t>
+      </w:r>
+    </w:p>
+    <w:p>
+      <w:pPr>
+        <w:rPr>
+          <w:sz w:val="24"/>
+          <w:szCs w:val="24"/>
+        </w:rPr>
+      </w:pPr>
+      <w:r>
+        <w:rPr>
+          <w:sz w:val="24"/>
+          <w:szCs w:val="24"/>
+          <w:rtl w:val="0"/>
+        </w:rPr>
+        <w:t xml:space="preserve">    Age INTEGER,</w:t>
+      </w:r>
+    </w:p>
+    <w:p>
+      <w:pPr>
+        <w:rPr>
+          <w:sz w:val="24"/>
+          <w:szCs w:val="24"/>
+        </w:rPr>
+      </w:pPr>
+      <w:r>
+        <w:rPr>
+          <w:sz w:val="24"/>
+          <w:szCs w:val="24"/>
+          <w:rtl w:val="0"/>
+        </w:rPr>
+        <w:t xml:space="preserve">    Email TEXT,</w:t>
+      </w:r>
+    </w:p>
+    <w:p>
+      <w:pPr>
+        <w:rPr>
+          <w:sz w:val="24"/>
+          <w:szCs w:val="24"/>
+        </w:rPr>
+      </w:pPr>
+      <w:r>
+        <w:rPr>
+          <w:sz w:val="24"/>
+          <w:szCs w:val="24"/>
+          <w:rtl w:val="0"/>
+        </w:rPr>
+        <w:t xml:space="preserve">    TimeStamp DATETIME</w:t>
+      </w:r>
+    </w:p>
+    <w:p>
+      <w:pPr>
+        <w:rPr>
+          <w:sz w:val="24"/>
+          <w:szCs w:val="24"/>
+        </w:rPr>
+      </w:pPr>
+      <w:r>
+        <w:rPr>
+          <w:sz w:val="24"/>
+          <w:szCs w:val="24"/>
+          <w:rtl w:val="0"/>
+        </w:rPr>
+        <w:t xml:space="preserve">);</w:t>
+      </w:r>
+    </w:p>
+    <w:p>
+      <w:pPr>
+        <w:rPr>
+          <w:sz w:val="24"/>
+          <w:szCs w:val="24"/>
+        </w:rPr>
+      </w:pPr>
+      <w:r>
+        <w:rPr>
+          <w:rtl w:val="0"/>
+        </w:rPr>
+      </w:r>
+    </w:p>
+    <w:p>
+      <w:pPr>
+        <w:rPr>
+          <w:sz w:val="24"/>
+          <w:szCs w:val="24"/>
+        </w:rPr>
+      </w:pPr>
+      <w:r>
+        <w:rPr>
+          <w:sz w:val="24"/>
+          <w:szCs w:val="24"/>
+          <w:rtl w:val="0"/>
+        </w:rPr>
+        <w:t xml:space="preserve">CREATE INDEX idx_users_email ON Users(Email);</w:t>
+      </w:r>
+    </w:p>
+    <w:p>
+      <w:pPr>
+        <w:rPr>
+          <w:sz w:val="24"/>
+          <w:szCs w:val="24"/>
+        </w:rPr>
+      </w:pPr>
+      <w:r>
+        <w:rPr>
+          <w:rtl w:val="0"/>
+        </w:rPr>
+      </w:r>
+    </w:p>
+    <w:p>
+      <w:pPr>
+        <w:rPr>
+          <w:sz w:val="24"/>
+          <w:szCs w:val="24"/>
+        </w:rPr>
+      </w:pPr>
+      <w:r>
+        <w:rPr>
+          <w:sz w:val="24"/>
+          <w:szCs w:val="24"/>
+          <w:rtl w:val="0"/>
+        </w:rPr>
+        <w:t xml:space="preserve">SELECT Name, Age, Email FROM Users WHERE Email = '</w:t>
+      </w:r>
+      <w:hyperlink r:id="rId6">
+        <w:r>
+          <w:rPr>
+            <w:color w:val="1155cc"/>
+            <w:sz w:val="24"/>
+            <w:szCs w:val="24"/>
+            <w:u w:val="single"/>
+            <w:rtl w:val="0"/>
+          </w:rPr>
+          <w:t xml:space="preserve">john@example.com</w:t>
+        </w:r>
+      </w:hyperlink>
+      <w:r>
+        <w:rPr>
+          <w:sz w:val="24"/>
+          <w:szCs w:val="24"/>
+          <w:rtl w:val="0"/>
+        </w:rPr>
+        <w:t xml:space="preserve">';</w:t>
+      </w:r>
+    </w:p>
+    <w:p>
+      <w:pPr>
+        <w:rPr>
+          <w:sz w:val="24"/>
+          <w:szCs w:val="24"/>
+        </w:rPr>
+      </w:pPr>
+      <w:r>
+        <w:rPr>
+          <w:rtl w:val="0"/>
+        </w:rPr>
+      </w:r>
+    </w:p>
+    <w:p>
+      <w:pPr>
+        <w:rPr>
+          <w:sz w:val="24"/>
+          <w:szCs w:val="24"/>
+        </w:rPr>
+      </w:pPr>
+      <w:r>
+        <w:rPr>
+          <w:sz w:val="24"/>
+          <w:szCs w:val="24"/>
+          <w:rtl w:val="0"/>
+        </w:rPr>
+        <w:t xml:space="preserve">2.</w:t>
+      </w:r>
+    </w:p>
+    <w:p>
+      <w:pPr>
+        <w:rPr>
+          <w:sz w:val="24"/>
+          <w:szCs w:val="24"/>
+        </w:rPr>
+      </w:pPr>
+      <w:r>
+        <w:rPr>
+          <w:sz w:val="24"/>
+          <w:szCs w:val="24"/>
+          <w:rtl w:val="0"/>
+        </w:rPr>
+        <w:t xml:space="preserve">SELECT Name, Subject, Score</w:t>
+      </w:r>
+    </w:p>
+    <w:p>
+      <w:pPr>
+        <w:rPr>
+          <w:sz w:val="24"/>
+          <w:szCs w:val="24"/>
+        </w:rPr>
+      </w:pPr>
+      <w:r>
+        <w:rPr>
+          <w:sz w:val="24"/>
+          <w:szCs w:val="24"/>
+          <w:rtl w:val="0"/>
+        </w:rPr>
+        <w:t xml:space="preserve">FROM Students</w:t>
+      </w:r>
+    </w:p>
+    <w:p>
+      <w:pPr>
+        <w:rPr>
+          <w:sz w:val="24"/>
+          <w:szCs w:val="24"/>
+        </w:rPr>
+      </w:pPr>
+      <w:r>
+        <w:rPr>
+          <w:sz w:val="24"/>
+          <w:szCs w:val="24"/>
+          <w:rtl w:val="0"/>
+        </w:rPr>
+        <w:t xml:space="preserve">WHERE Score = (</w:t>
+      </w:r>
+    </w:p>
+    <w:p>
+      <w:pPr>
+        <w:rPr>
+          <w:sz w:val="24"/>
+          <w:szCs w:val="24"/>
+        </w:rPr>
+      </w:pPr>
+      <w:r>
+        <w:rPr>
+          <w:sz w:val="24"/>
+          <w:szCs w:val="24"/>
+          <w:rtl w:val="0"/>
+        </w:rPr>
+        <w:t xml:space="preserve">    SELECT MAX(Score)</w:t>
+      </w:r>
+    </w:p>
+    <w:p>
+      <w:pPr>
+        <w:rPr>
+          <w:sz w:val="24"/>
+          <w:szCs w:val="24"/>
+        </w:rPr>
+      </w:pPr>
+      <w:r>
+        <w:rPr>
+          <w:sz w:val="24"/>
+          <w:szCs w:val="24"/>
+          <w:rtl w:val="0"/>
+        </w:rPr>
+        <w:t xml:space="preserve">    FROM Students AS Student2</w:t>
+      </w:r>
+    </w:p>
+    <w:p>
+      <w:pPr>
+        <w:rPr>
+          <w:sz w:val="24"/>
+          <w:szCs w:val="24"/>
+        </w:rPr>
+      </w:pPr>
+      <w:r>
+        <w:rPr>
+          <w:sz w:val="24"/>
+          <w:szCs w:val="24"/>
+          <w:rtl w:val="0"/>
+        </w:rPr>
+        <w:t xml:space="preserve">    WHERE Student2.Subject = Students.Subject</w:t>
+      </w:r>
+    </w:p>
+    <w:p>
+      <w:pPr>
+        <w:rPr>
+          <w:sz w:val="24"/>
+          <w:szCs w:val="24"/>
+        </w:rPr>
+      </w:pPr>
+      <w:r>
+        <w:rPr>
+          <w:sz w:val="24"/>
+          <w:szCs w:val="24"/>
+          <w:rtl w:val="0"/>
+        </w:rPr>
+        <w:t xml:space="preserve">);</w:t>
+      </w:r>
+    </w:p>
+    <w:p>
+      <w:pPr>
+        <w:rPr>
+          <w:sz w:val="24"/>
+          <w:szCs w:val="24"/>
+        </w:rPr>
+      </w:pPr>
+      <w:r>
+        <w:rPr>
+          <w:rtl w:val="0"/>
+        </w:rPr>
+      </w:r>
+    </w:p>
+    <w:p>
+      <w:pPr>
+        <w:rPr>
+          <w:sz w:val="24"/>
+          <w:szCs w:val="24"/>
+        </w:rPr>
+      </w:pPr>
+      <w:r>
+        <w:rPr>
+          <w:sz w:val="24"/>
+          <w:szCs w:val="24"/>
+          <w:rtl w:val="0"/>
+        </w:rPr>
+        <w:t xml:space="preserve">3.1</w:t>
+      </w:r>
+    </w:p>
+    <w:p>
+      <w:pPr>
+        <w:rPr>
+          <w:sz w:val="24"/>
+          <w:szCs w:val="24"/>
+        </w:rPr>
+      </w:pPr>
+      <w:r>
+        <w:rPr>
+          <w:rtl w:val="0"/>
+        </w:rPr>
+      </w:r>
+    </w:p>
+    <w:p>
+      <w:pPr>
+        <w:rPr>
+          <w:sz w:val="24"/>
+          <w:szCs w:val="24"/>
+        </w:rPr>
+      </w:pPr>
+      <w:r>
+        <w:rPr>
+          <w:sz w:val="24"/>
+          <w:szCs w:val="24"/>
+          <w:rtl w:val="0"/>
+        </w:rPr>
+        <w:t xml:space="preserve">SELECT SUM(quantity_sold) AS total_quantity_sold</w:t>
+      </w:r>
+    </w:p>
+    <w:p>
+      <w:pPr>
+        <w:rPr>
+          <w:sz w:val="24"/>
+          <w:szCs w:val="24"/>
+        </w:rPr>
+      </w:pPr>
+      <w:r>
+        <w:rPr>
+          <w:sz w:val="24"/>
+          <w:szCs w:val="24"/>
+          <w:rtl w:val="0"/>
+        </w:rPr>
+        <w:t xml:space="preserve">FROM Sales;</w:t>
+      </w:r>
+    </w:p>
+    <w:p>
+      <w:pPr>
+        <w:rPr>
+          <w:sz w:val="24"/>
+          <w:szCs w:val="24"/>
+        </w:rPr>
+      </w:pPr>
+      <w:r>
+        <w:rPr>
+          <w:rtl w:val="0"/>
+        </w:rPr>
+      </w:r>
+    </w:p>
+    <w:p>
+      <w:pPr>
+        <w:rPr>
+          <w:sz w:val="24"/>
+          <w:szCs w:val="24"/>
+        </w:rPr>
+      </w:pPr>
+      <w:r>
+        <w:rPr>
+          <w:sz w:val="24"/>
+          <w:szCs w:val="24"/>
+          <w:rtl w:val="0"/>
+        </w:rPr>
+        <w:t xml:space="preserve">3.2</w:t>
+      </w:r>
+    </w:p>
+    <w:p>
+      <w:pPr>
+        <w:rPr>
+          <w:sz w:val="24"/>
+          <w:szCs w:val="24"/>
+        </w:rPr>
+      </w:pPr>
+      <w:r>
+        <w:rPr>
+          <w:sz w:val="24"/>
+          <w:szCs w:val="24"/>
+          <w:rtl w:val="0"/>
+        </w:rPr>
+        <w:t xml:space="preserve">SELECT product_name, unit_price</w:t>
+      </w:r>
+    </w:p>
+    <w:p>
+      <w:pPr>
+        <w:rPr>
+          <w:sz w:val="24"/>
+          <w:szCs w:val="24"/>
+        </w:rPr>
+      </w:pPr>
+      <w:r>
+        <w:rPr>
+          <w:sz w:val="24"/>
+          <w:szCs w:val="24"/>
+          <w:rtl w:val="0"/>
+        </w:rPr>
+        <w:t xml:space="preserve">FROM Products</w:t>
+      </w:r>
+    </w:p>
+    <w:p>
+      <w:pPr>
+        <w:rPr>
+          <w:sz w:val="24"/>
+          <w:szCs w:val="24"/>
+        </w:rPr>
+      </w:pPr>
+      <w:r>
+        <w:rPr>
+          <w:sz w:val="24"/>
+          <w:szCs w:val="24"/>
+          <w:rtl w:val="0"/>
+        </w:rPr>
+        <w:t xml:space="preserve">WHERE unit_price = (</w:t>
+      </w:r>
+    </w:p>
+    <w:p>
+      <w:pPr>
+        <w:rPr>
+          <w:sz w:val="24"/>
+          <w:szCs w:val="24"/>
+        </w:rPr>
+      </w:pPr>
+      <w:r>
+        <w:rPr>
+          <w:sz w:val="24"/>
+          <w:szCs w:val="24"/>
+          <w:rtl w:val="0"/>
+        </w:rPr>
+        <w:t xml:space="preserve">    SELECT MAX(unit_price) FROM Products</w:t>
+      </w:r>
+    </w:p>
+    <w:p>
+      <w:pPr>
+        <w:rPr>
+          <w:sz w:val="24"/>
+          <w:szCs w:val="24"/>
+        </w:rPr>
+      </w:pPr>
+      <w:r>
+        <w:rPr>
+          <w:sz w:val="24"/>
+          <w:szCs w:val="24"/>
+          <w:rtl w:val="0"/>
+        </w:rPr>
+        <w:t xml:space="preserve">);</w:t>
+      </w:r>
+    </w:p>
+    <w:p>
+      <w:pPr>
+        <w:rPr>
+          <w:sz w:val="24"/>
+          <w:szCs w:val="24"/>
+        </w:rPr>
+      </w:pPr>
+      <w:r>
+        <w:rPr>
+          <w:rtl w:val="0"/>
+        </w:rPr>
+      </w:r>
+    </w:p>
+    <w:p>
+      <w:pPr>
+        <w:rPr>
+          <w:sz w:val="24"/>
+          <w:szCs w:val="24"/>
+        </w:rPr>
+      </w:pPr>
+      <w:r>
+        <w:rPr>
+          <w:sz w:val="24"/>
+          <w:szCs w:val="24"/>
+          <w:rtl w:val="0"/>
+        </w:rPr>
+        <w:t xml:space="preserve">3.3</w:t>
+      </w:r>
+    </w:p>
+    <w:p>
+      <w:pPr>
+        <w:rPr>
+          <w:sz w:val="24"/>
+          <w:szCs w:val="24"/>
+        </w:rPr>
+      </w:pPr>
+      <w:r>
+        <w:rPr>
+          <w:sz w:val="24"/>
+          <w:szCs w:val="24"/>
+          <w:rtl w:val="0"/>
+        </w:rPr>
+        <w:t xml:space="preserve">SELECT p.product_id, p.product_name</w:t>
+      </w:r>
+    </w:p>
+    <w:p>
+      <w:pPr>
+        <w:rPr>
+          <w:sz w:val="24"/>
+          <w:szCs w:val="24"/>
+        </w:rPr>
+      </w:pPr>
+      <w:r>
+        <w:rPr>
+          <w:sz w:val="24"/>
+          <w:szCs w:val="24"/>
+          <w:rtl w:val="0"/>
+        </w:rPr>
+        <w:t xml:space="preserve">FROM Products p</w:t>
+      </w:r>
+    </w:p>
+    <w:p>
+      <w:pPr>
+        <w:rPr>
+          <w:sz w:val="24"/>
+          <w:szCs w:val="24"/>
+        </w:rPr>
+      </w:pPr>
+      <w:r>
+        <w:rPr>
+          <w:sz w:val="24"/>
+          <w:szCs w:val="24"/>
+          <w:rtl w:val="0"/>
+        </w:rPr>
+        <w:t xml:space="preserve">LEFT JOIN Sales s ON p.product_id = s.product_id</w:t>
+      </w:r>
+    </w:p>
+    <w:p>
+      <w:pPr>
+        <w:rPr>
+          <w:sz w:val="24"/>
+          <w:szCs w:val="24"/>
+        </w:rPr>
+      </w:pPr>
+      <w:r>
+        <w:rPr>
+          <w:sz w:val="24"/>
+          <w:szCs w:val="24"/>
+          <w:rtl w:val="0"/>
+        </w:rPr>
+        <w:t xml:space="preserve">WHERE s.product_id IS NULL;</w:t>
+      </w:r>
+    </w:p>
+    <w:p>
+      <w:pPr>
+        <w:rPr>
           <w:sz w:val="24"/>
           <w:szCs w:val="24"/>
         </w:rPr>
@@ -4167,7 +5247,121 @@
 </file>
 
 <file path=word/numbering.xml><?xml version="1.0" encoding="utf-8"?>
-<w:numbering xmlns:mc="http://schemas.openxmlformats.org/markup-compatibility/2006" xmlns:o="urn:schemas-microsoft-com:office:office" xmlns:r="http://schemas.openxmlformats.org/officeDocument/2006/relationships" xmlns:m="http://schemas.openxmlformats.org/officeDocument/2006/math" xmlns:v="urn:schemas-microsoft-com:vml" xmlns:wp="http://schemas.openxmlformats.org/drawingml/2006/wordprocessingDrawing" xmlns:w10="urn:schemas-microsoft-com:office:word" xmlns:w="http://schemas.openxmlformats.org/wordprocessingml/2006/main" xmlns:wne="http://schemas.microsoft.com/office/word/2006/wordml" xmlns:sl="http://schemas.openxmlformats.org/schemaLibrary/2006/main" xmlns:a="http://schemas.openxmlformats.org/drawingml/2006/main" xmlns:pic="http://schemas.openxmlformats.org/drawingml/2006/picture" xmlns:c="http://schemas.openxmlformats.org/drawingml/2006/chart" xmlns:lc="http://schemas.openxmlformats.org/drawingml/2006/lockedCanvas" xmlns:dgm="http://schemas.openxmlformats.org/drawingml/2006/diagram" xmlns:wps="http://schemas.microsoft.com/office/word/2010/wordprocessingShape" xmlns:wpg="http://schemas.microsoft.com/office/word/2010/wordprocessingGroup" xmlns:w14="http://schemas.microsoft.com/office/word/2010/wordml" xmlns:w15="http://schemas.microsoft.com/office/word/2012/wordml" xmlns:w16="http://schemas.microsoft.com/office/word/2018/wordml" xmlns:w16cex="http://schemas.microsoft.com/office/word/2018/wordml/cex" xmlns:w16cid="http://schemas.microsoft.com/office/word/2016/wordml/cid" xmlns="http://schemas.microsoft.com/office/tasks/2019/documenttasks" xmlns:cr="http://schemas.microsoft.com/office/comments/2020/reactions"/>
+<w:numbering xmlns:mc="http://schemas.openxmlformats.org/markup-compatibility/2006" xmlns:o="urn:schemas-microsoft-com:office:office" xmlns:r="http://schemas.openxmlformats.org/officeDocument/2006/relationships" xmlns:m="http://schemas.openxmlformats.org/officeDocument/2006/math" xmlns:v="urn:schemas-microsoft-com:vml" xmlns:wp="http://schemas.openxmlformats.org/drawingml/2006/wordprocessingDrawing" xmlns:w10="urn:schemas-microsoft-com:office:word" xmlns:w="http://schemas.openxmlformats.org/wordprocessingml/2006/main" xmlns:wne="http://schemas.microsoft.com/office/word/2006/wordml" xmlns:sl="http://schemas.openxmlformats.org/schemaLibrary/2006/main" xmlns:a="http://schemas.openxmlformats.org/drawingml/2006/main" xmlns:pic="http://schemas.openxmlformats.org/drawingml/2006/picture" xmlns:c="http://schemas.openxmlformats.org/drawingml/2006/chart" xmlns:lc="http://schemas.openxmlformats.org/drawingml/2006/lockedCanvas" xmlns:dgm="http://schemas.openxmlformats.org/drawingml/2006/diagram" xmlns:wps="http://schemas.microsoft.com/office/word/2010/wordprocessingShape" xmlns:wpg="http://schemas.microsoft.com/office/word/2010/wordprocessingGroup" xmlns:w14="http://schemas.microsoft.com/office/word/2010/wordml" xmlns:w15="http://schemas.microsoft.com/office/word/2012/wordml" xmlns:w16="http://schemas.microsoft.com/office/word/2018/wordml" xmlns:w16cex="http://schemas.microsoft.com/office/word/2018/wordml/cex" xmlns:w16cid="http://schemas.microsoft.com/office/word/2016/wordml/cid" xmlns="http://schemas.microsoft.com/office/tasks/2019/documenttasks" xmlns:cr="http://schemas.microsoft.com/office/comments/2020/reactions">
+  <w:abstractNum w:abstractNumId="1">
+    <w:lvl w:ilvl="0">
+      <w:start w:val="1"/>
+      <w:numFmt w:val="bullet"/>
+      <w:lvlText w:val="●"/>
+      <w:lvlJc w:val="left"/>
+      <w:pPr>
+        <w:ind w:left="720" w:hanging="360"/>
+      </w:pPr>
+      <w:rPr>
+        <w:u w:val="none"/>
+      </w:rPr>
+    </w:lvl>
+    <w:lvl w:ilvl="1">
+      <w:start w:val="1"/>
+      <w:numFmt w:val="bullet"/>
+      <w:lvlText w:val="○"/>
+      <w:lvlJc w:val="left"/>
+      <w:pPr>
+        <w:ind w:left="1440" w:hanging="360"/>
+      </w:pPr>
+      <w:rPr>
+        <w:u w:val="none"/>
+      </w:rPr>
+    </w:lvl>
+    <w:lvl w:ilvl="2">
+      <w:start w:val="1"/>
+      <w:numFmt w:val="bullet"/>
+      <w:lvlText w:val="■"/>
+      <w:lvlJc w:val="left"/>
+      <w:pPr>
+        <w:ind w:left="2160" w:hanging="360"/>
+      </w:pPr>
+      <w:rPr>
+        <w:u w:val="none"/>
+      </w:rPr>
+    </w:lvl>
+    <w:lvl w:ilvl="3">
+      <w:start w:val="1"/>
+      <w:numFmt w:val="bullet"/>
+      <w:lvlText w:val="●"/>
+      <w:lvlJc w:val="left"/>
+      <w:pPr>
+        <w:ind w:left="2880" w:hanging="360"/>
+      </w:pPr>
+      <w:rPr>
+        <w:u w:val="none"/>
+      </w:rPr>
+    </w:lvl>
+    <w:lvl w:ilvl="4">
+      <w:start w:val="1"/>
+      <w:numFmt w:val="bullet"/>
+      <w:lvlText w:val="○"/>
+      <w:lvlJc w:val="left"/>
+      <w:pPr>
+        <w:ind w:left="3600" w:hanging="360"/>
+      </w:pPr>
+      <w:rPr>
+        <w:u w:val="none"/>
+      </w:rPr>
+    </w:lvl>
+    <w:lvl w:ilvl="5">
+      <w:start w:val="1"/>
+      <w:numFmt w:val="bullet"/>
+      <w:lvlText w:val="■"/>
+      <w:lvlJc w:val="left"/>
+      <w:pPr>
+        <w:ind w:left="4320" w:hanging="360"/>
+      </w:pPr>
+      <w:rPr>
+        <w:u w:val="none"/>
+      </w:rPr>
+    </w:lvl>
+    <w:lvl w:ilvl="6">
+      <w:start w:val="1"/>
+      <w:numFmt w:val="bullet"/>
+      <w:lvlText w:val="●"/>
+      <w:lvlJc w:val="left"/>
+      <w:pPr>
+        <w:ind w:left="5040" w:hanging="360"/>
+      </w:pPr>
+      <w:rPr>
+        <w:u w:val="none"/>
+      </w:rPr>
+    </w:lvl>
+    <w:lvl w:ilvl="7">
+      <w:start w:val="1"/>
+      <w:numFmt w:val="bullet"/>
+      <w:lvlText w:val="○"/>
+      <w:lvlJc w:val="left"/>
+      <w:pPr>
+        <w:ind w:left="5760" w:hanging="360"/>
+      </w:pPr>
+      <w:rPr>
+        <w:u w:val="none"/>
+      </w:rPr>
+    </w:lvl>
+    <w:lvl w:ilvl="8">
+      <w:start w:val="1"/>
+      <w:numFmt w:val="bullet"/>
+      <w:lvlText w:val="■"/>
+      <w:lvlJc w:val="left"/>
+      <w:pPr>
+        <w:ind w:left="6480" w:hanging="360"/>
+      </w:pPr>
+      <w:rPr>
+        <w:u w:val="none"/>
+      </w:rPr>
+    </w:lvl>
+  </w:abstractNum>
+  <w:num w:numId="1">
+    <w:abstractNumId w:val="1"/>
+  </w:num>
+</w:numbering>
 </file>
 
 <file path=word/styles.xml><?xml version="1.0" encoding="utf-8"?>

</xml_diff>